<commit_message>
Sổ tay/Lộ trình theo thực tế + canary A11 đã kiểm bằng caddy adapt; DATA_DIR cho dịch vụ; tách nhật ký
- docs/plan: D:\Platform → D:\ITSupportPlatform (+Secrets/Data); khung "Thực tế triển khai"
  (Atlas, Core cùng máy 127.0.0.1:7009, NSSM PlatformCore). Sổ tay 3.2 không bắt buộc
  (đã rà đủ 19 đường dẫn agent trong mã), 3.4/3.5/3.6/3.8 viết lại với lệnh PowerShell
  + API /api/legacy/*; điều kiện canary lọc IP + đường dẫn (đã thử caddy adapt/validate trên
  bản sao Caddyfile: đứng trước @hub, 3 dòng path gộp HOẶC). Lộ trình G6 sửa theo. docx dựng lại.
- dich_vu_core.ps1: DATA_DIR=D:\ITSupportPlatformData; CapNhat tự đồng bộ biến môi trường;
  KiemTra cảnh báo biến thiếu.
- server.py: INFO → core-out.log, WARNING+ → core-err.log (Sổ tay dùng "core-err.log có dòng mới").

Co-Authored-By: Claude Opus 5.5 <noreply@anthropic.com>
</commit_message>
<xml_diff>
--- a/docs/plan/PhuongAn_SaaS_ITMonitor.docx
+++ b/docs/plan/PhuongAn_SaaS_ITMonitor.docx
@@ -627,7 +627,7 @@
                 <w:rFonts w:ascii="Consolas" w:hAnsi="Consolas" w:eastAsia="Consolas" w:cs="Consolas"/>
                 <w:sz w:val="21"/>
               </w:rPr>
-              <w:t>D:\Platform</w:t>
+              <w:t>D:\ITSupportPlatform</w:t>
             </w:r>
             <w:r>
               <w:t xml:space="preserve">; không sửa cấu trúc mã nguồn của </w:t>
@@ -4083,11 +4083,11 @@
         </w:tblBorders>
       </w:tblPr>
       <w:tblGrid>
-        <w:gridCol w:w="858"/>
-        <w:gridCol w:w="2525"/>
-        <w:gridCol w:w="3461"/>
-        <w:gridCol w:w="936"/>
-        <w:gridCol w:w="1291"/>
+        <w:gridCol w:w="826"/>
+        <w:gridCol w:w="3039"/>
+        <w:gridCol w:w="3091"/>
+        <w:gridCol w:w="879"/>
+        <w:gridCol w:w="1235"/>
       </w:tblGrid>
       <w:tr>
         <w:trPr>
@@ -4095,7 +4095,7 @@
         </w:trPr>
         <w:tc>
           <w:tcPr>
-            <w:tcW w:type="dxa" w:w="858"/>
+            <w:tcW w:type="dxa" w:w="826"/>
             <w:shd w:val="clear" w:color="auto" w:fill="E3ECE9"/>
           </w:tcPr>
           <w:p>
@@ -4113,7 +4113,7 @@
         </w:tc>
         <w:tc>
           <w:tcPr>
-            <w:tcW w:type="dxa" w:w="2525"/>
+            <w:tcW w:type="dxa" w:w="3039"/>
             <w:shd w:val="clear" w:color="auto" w:fill="E3ECE9"/>
           </w:tcPr>
           <w:p>
@@ -4131,7 +4131,7 @@
         </w:tc>
         <w:tc>
           <w:tcPr>
-            <w:tcW w:type="dxa" w:w="3461"/>
+            <w:tcW w:type="dxa" w:w="3091"/>
             <w:shd w:val="clear" w:color="auto" w:fill="E3ECE9"/>
           </w:tcPr>
           <w:p>
@@ -4149,7 +4149,7 @@
         </w:tc>
         <w:tc>
           <w:tcPr>
-            <w:tcW w:type="dxa" w:w="936"/>
+            <w:tcW w:type="dxa" w:w="879"/>
             <w:shd w:val="clear" w:color="auto" w:fill="E3ECE9"/>
           </w:tcPr>
           <w:p>
@@ -4167,7 +4167,7 @@
         </w:tc>
         <w:tc>
           <w:tcPr>
-            <w:tcW w:type="dxa" w:w="1291"/>
+            <w:tcW w:type="dxa" w:w="1235"/>
             <w:shd w:val="clear" w:color="auto" w:fill="E3ECE9"/>
           </w:tcPr>
           <w:p>
@@ -4187,7 +4187,7 @@
       <w:tr>
         <w:tc>
           <w:tcPr>
-            <w:tcW w:type="dxa" w:w="858"/>
+            <w:tcW w:type="dxa" w:w="826"/>
           </w:tcPr>
           <w:p>
             <w:pPr>
@@ -4203,7 +4203,7 @@
         </w:tc>
         <w:tc>
           <w:tcPr>
-            <w:tcW w:type="dxa" w:w="2525"/>
+            <w:tcW w:type="dxa" w:w="3039"/>
           </w:tcPr>
           <w:p>
             <w:pPr>
@@ -4226,7 +4226,7 @@
         </w:tc>
         <w:tc>
           <w:tcPr>
-            <w:tcW w:type="dxa" w:w="3461"/>
+            <w:tcW w:type="dxa" w:w="3091"/>
           </w:tcPr>
           <w:p>
             <w:pPr>
@@ -4242,7 +4242,7 @@
         </w:tc>
         <w:tc>
           <w:tcPr>
-            <w:tcW w:type="dxa" w:w="936"/>
+            <w:tcW w:type="dxa" w:w="879"/>
           </w:tcPr>
           <w:p>
             <w:pPr>
@@ -4260,7 +4260,7 @@
         </w:tc>
         <w:tc>
           <w:tcPr>
-            <w:tcW w:type="dxa" w:w="1291"/>
+            <w:tcW w:type="dxa" w:w="1235"/>
           </w:tcPr>
           <w:p>
             <w:pPr>
@@ -4278,7 +4278,7 @@
       <w:tr>
         <w:tc>
           <w:tcPr>
-            <w:tcW w:type="dxa" w:w="858"/>
+            <w:tcW w:type="dxa" w:w="826"/>
           </w:tcPr>
           <w:p>
             <w:pPr>
@@ -4294,7 +4294,7 @@
         </w:tc>
         <w:tc>
           <w:tcPr>
-            <w:tcW w:type="dxa" w:w="2525"/>
+            <w:tcW w:type="dxa" w:w="3039"/>
           </w:tcPr>
           <w:p>
             <w:pPr>
@@ -4317,7 +4317,7 @@
         </w:tc>
         <w:tc>
           <w:tcPr>
-            <w:tcW w:type="dxa" w:w="3461"/>
+            <w:tcW w:type="dxa" w:w="3091"/>
           </w:tcPr>
           <w:p>
             <w:pPr>
@@ -4333,7 +4333,7 @@
         </w:tc>
         <w:tc>
           <w:tcPr>
-            <w:tcW w:type="dxa" w:w="936"/>
+            <w:tcW w:type="dxa" w:w="879"/>
           </w:tcPr>
           <w:p>
             <w:pPr>
@@ -4351,7 +4351,7 @@
         </w:tc>
         <w:tc>
           <w:tcPr>
-            <w:tcW w:type="dxa" w:w="1291"/>
+            <w:tcW w:type="dxa" w:w="1235"/>
           </w:tcPr>
           <w:p>
             <w:pPr>
@@ -4369,7 +4369,7 @@
       <w:tr>
         <w:tc>
           <w:tcPr>
-            <w:tcW w:type="dxa" w:w="858"/>
+            <w:tcW w:type="dxa" w:w="826"/>
           </w:tcPr>
           <w:p>
             <w:pPr>
@@ -4385,7 +4385,7 @@
         </w:tc>
         <w:tc>
           <w:tcPr>
-            <w:tcW w:type="dxa" w:w="2525"/>
+            <w:tcW w:type="dxa" w:w="3039"/>
           </w:tcPr>
           <w:p>
             <w:pPr>
@@ -4408,7 +4408,7 @@
         </w:tc>
         <w:tc>
           <w:tcPr>
-            <w:tcW w:type="dxa" w:w="3461"/>
+            <w:tcW w:type="dxa" w:w="3091"/>
           </w:tcPr>
           <w:p>
             <w:pPr>
@@ -4424,7 +4424,7 @@
         </w:tc>
         <w:tc>
           <w:tcPr>
-            <w:tcW w:type="dxa" w:w="936"/>
+            <w:tcW w:type="dxa" w:w="879"/>
           </w:tcPr>
           <w:p>
             <w:pPr>
@@ -4442,7 +4442,7 @@
         </w:tc>
         <w:tc>
           <w:tcPr>
-            <w:tcW w:type="dxa" w:w="1291"/>
+            <w:tcW w:type="dxa" w:w="1235"/>
           </w:tcPr>
           <w:p>
             <w:pPr>
@@ -4460,7 +4460,7 @@
       <w:tr>
         <w:tc>
           <w:tcPr>
-            <w:tcW w:type="dxa" w:w="858"/>
+            <w:tcW w:type="dxa" w:w="826"/>
           </w:tcPr>
           <w:p>
             <w:pPr>
@@ -4476,7 +4476,7 @@
         </w:tc>
         <w:tc>
           <w:tcPr>
-            <w:tcW w:type="dxa" w:w="2525"/>
+            <w:tcW w:type="dxa" w:w="3039"/>
           </w:tcPr>
           <w:p>
             <w:pPr>
@@ -4499,7 +4499,7 @@
         </w:tc>
         <w:tc>
           <w:tcPr>
-            <w:tcW w:type="dxa" w:w="3461"/>
+            <w:tcW w:type="dxa" w:w="3091"/>
           </w:tcPr>
           <w:p>
             <w:pPr>
@@ -4515,7 +4515,7 @@
         </w:tc>
         <w:tc>
           <w:tcPr>
-            <w:tcW w:type="dxa" w:w="936"/>
+            <w:tcW w:type="dxa" w:w="879"/>
           </w:tcPr>
           <w:p>
             <w:pPr>
@@ -4533,7 +4533,7 @@
         </w:tc>
         <w:tc>
           <w:tcPr>
-            <w:tcW w:type="dxa" w:w="1291"/>
+            <w:tcW w:type="dxa" w:w="1235"/>
           </w:tcPr>
           <w:p>
             <w:pPr>
@@ -4551,7 +4551,7 @@
       <w:tr>
         <w:tc>
           <w:tcPr>
-            <w:tcW w:type="dxa" w:w="858"/>
+            <w:tcW w:type="dxa" w:w="826"/>
           </w:tcPr>
           <w:p>
             <w:pPr>
@@ -4567,7 +4567,7 @@
         </w:tc>
         <w:tc>
           <w:tcPr>
-            <w:tcW w:type="dxa" w:w="2525"/>
+            <w:tcW w:type="dxa" w:w="3039"/>
           </w:tcPr>
           <w:p>
             <w:pPr>
@@ -4590,7 +4590,7 @@
         </w:tc>
         <w:tc>
           <w:tcPr>
-            <w:tcW w:type="dxa" w:w="3461"/>
+            <w:tcW w:type="dxa" w:w="3091"/>
           </w:tcPr>
           <w:p>
             <w:pPr>
@@ -4606,7 +4606,7 @@
         </w:tc>
         <w:tc>
           <w:tcPr>
-            <w:tcW w:type="dxa" w:w="936"/>
+            <w:tcW w:type="dxa" w:w="879"/>
           </w:tcPr>
           <w:p>
             <w:pPr>
@@ -4624,7 +4624,7 @@
         </w:tc>
         <w:tc>
           <w:tcPr>
-            <w:tcW w:type="dxa" w:w="1291"/>
+            <w:tcW w:type="dxa" w:w="1235"/>
           </w:tcPr>
           <w:p>
             <w:pPr>
@@ -4642,7 +4642,7 @@
       <w:tr>
         <w:tc>
           <w:tcPr>
-            <w:tcW w:type="dxa" w:w="858"/>
+            <w:tcW w:type="dxa" w:w="826"/>
           </w:tcPr>
           <w:p>
             <w:pPr>
@@ -4658,7 +4658,7 @@
         </w:tc>
         <w:tc>
           <w:tcPr>
-            <w:tcW w:type="dxa" w:w="2525"/>
+            <w:tcW w:type="dxa" w:w="3039"/>
           </w:tcPr>
           <w:p>
             <w:pPr>
@@ -4683,7 +4683,7 @@
         </w:tc>
         <w:tc>
           <w:tcPr>
-            <w:tcW w:type="dxa" w:w="3461"/>
+            <w:tcW w:type="dxa" w:w="3091"/>
           </w:tcPr>
           <w:p>
             <w:pPr>
@@ -4699,7 +4699,7 @@
         </w:tc>
         <w:tc>
           <w:tcPr>
-            <w:tcW w:type="dxa" w:w="936"/>
+            <w:tcW w:type="dxa" w:w="879"/>
           </w:tcPr>
           <w:p>
             <w:pPr>
@@ -4717,7 +4717,7 @@
         </w:tc>
         <w:tc>
           <w:tcPr>
-            <w:tcW w:type="dxa" w:w="1291"/>
+            <w:tcW w:type="dxa" w:w="1235"/>
           </w:tcPr>
           <w:p>
             <w:pPr>
@@ -4735,7 +4735,7 @@
       <w:tr>
         <w:tc>
           <w:tcPr>
-            <w:tcW w:type="dxa" w:w="858"/>
+            <w:tcW w:type="dxa" w:w="826"/>
           </w:tcPr>
           <w:p>
             <w:pPr>
@@ -4751,7 +4751,7 @@
         </w:tc>
         <w:tc>
           <w:tcPr>
-            <w:tcW w:type="dxa" w:w="2525"/>
+            <w:tcW w:type="dxa" w:w="3039"/>
           </w:tcPr>
           <w:p>
             <w:pPr>
@@ -4774,7 +4774,7 @@
         </w:tc>
         <w:tc>
           <w:tcPr>
-            <w:tcW w:type="dxa" w:w="3461"/>
+            <w:tcW w:type="dxa" w:w="3091"/>
           </w:tcPr>
           <w:p>
             <w:pPr>
@@ -4790,7 +4790,7 @@
         </w:tc>
         <w:tc>
           <w:tcPr>
-            <w:tcW w:type="dxa" w:w="936"/>
+            <w:tcW w:type="dxa" w:w="879"/>
           </w:tcPr>
           <w:p>
             <w:pPr>
@@ -4808,7 +4808,7 @@
         </w:tc>
         <w:tc>
           <w:tcPr>
-            <w:tcW w:type="dxa" w:w="1291"/>
+            <w:tcW w:type="dxa" w:w="1235"/>
           </w:tcPr>
           <w:p>
             <w:pPr>
@@ -4826,7 +4826,7 @@
       <w:tr>
         <w:tc>
           <w:tcPr>
-            <w:tcW w:type="dxa" w:w="858"/>
+            <w:tcW w:type="dxa" w:w="826"/>
           </w:tcPr>
           <w:p>
             <w:pPr>
@@ -4842,7 +4842,7 @@
         </w:tc>
         <w:tc>
           <w:tcPr>
-            <w:tcW w:type="dxa" w:w="2525"/>
+            <w:tcW w:type="dxa" w:w="3039"/>
           </w:tcPr>
           <w:p>
             <w:pPr>
@@ -4859,7 +4859,7 @@
         </w:tc>
         <w:tc>
           <w:tcPr>
-            <w:tcW w:type="dxa" w:w="3461"/>
+            <w:tcW w:type="dxa" w:w="3091"/>
           </w:tcPr>
           <w:p>
             <w:pPr>
@@ -4875,7 +4875,7 @@
         </w:tc>
         <w:tc>
           <w:tcPr>
-            <w:tcW w:type="dxa" w:w="936"/>
+            <w:tcW w:type="dxa" w:w="879"/>
           </w:tcPr>
           <w:p>
             <w:pPr>
@@ -4893,7 +4893,7 @@
         </w:tc>
         <w:tc>
           <w:tcPr>
-            <w:tcW w:type="dxa" w:w="1291"/>
+            <w:tcW w:type="dxa" w:w="1235"/>
           </w:tcPr>
           <w:p>
             <w:pPr>
@@ -4911,7 +4911,7 @@
       <w:tr>
         <w:tc>
           <w:tcPr>
-            <w:tcW w:type="dxa" w:w="858"/>
+            <w:tcW w:type="dxa" w:w="826"/>
           </w:tcPr>
           <w:p>
             <w:pPr>
@@ -4927,7 +4927,7 @@
         </w:tc>
         <w:tc>
           <w:tcPr>
-            <w:tcW w:type="dxa" w:w="2525"/>
+            <w:tcW w:type="dxa" w:w="3039"/>
           </w:tcPr>
           <w:p>
             <w:pPr>
@@ -4950,7 +4950,7 @@
         </w:tc>
         <w:tc>
           <w:tcPr>
-            <w:tcW w:type="dxa" w:w="3461"/>
+            <w:tcW w:type="dxa" w:w="3091"/>
           </w:tcPr>
           <w:p>
             <w:pPr>
@@ -4966,7 +4966,7 @@
         </w:tc>
         <w:tc>
           <w:tcPr>
-            <w:tcW w:type="dxa" w:w="936"/>
+            <w:tcW w:type="dxa" w:w="879"/>
           </w:tcPr>
           <w:p>
             <w:pPr>
@@ -4984,7 +4984,7 @@
         </w:tc>
         <w:tc>
           <w:tcPr>
-            <w:tcW w:type="dxa" w:w="1291"/>
+            <w:tcW w:type="dxa" w:w="1235"/>
           </w:tcPr>
           <w:p>
             <w:pPr>
@@ -5002,7 +5002,7 @@
       <w:tr>
         <w:tc>
           <w:tcPr>
-            <w:tcW w:type="dxa" w:w="858"/>
+            <w:tcW w:type="dxa" w:w="826"/>
           </w:tcPr>
           <w:p>
             <w:pPr>
@@ -5018,7 +5018,7 @@
         </w:tc>
         <w:tc>
           <w:tcPr>
-            <w:tcW w:type="dxa" w:w="2525"/>
+            <w:tcW w:type="dxa" w:w="3039"/>
           </w:tcPr>
           <w:p>
             <w:pPr>
@@ -5041,7 +5041,7 @@
         </w:tc>
         <w:tc>
           <w:tcPr>
-            <w:tcW w:type="dxa" w:w="3461"/>
+            <w:tcW w:type="dxa" w:w="3091"/>
           </w:tcPr>
           <w:p>
             <w:pPr>
@@ -5057,7 +5057,7 @@
         </w:tc>
         <w:tc>
           <w:tcPr>
-            <w:tcW w:type="dxa" w:w="936"/>
+            <w:tcW w:type="dxa" w:w="879"/>
           </w:tcPr>
           <w:p>
             <w:pPr>
@@ -5075,7 +5075,7 @@
         </w:tc>
         <w:tc>
           <w:tcPr>
-            <w:tcW w:type="dxa" w:w="1291"/>
+            <w:tcW w:type="dxa" w:w="1235"/>
           </w:tcPr>
           <w:p>
             <w:pPr>
@@ -5093,7 +5093,7 @@
       <w:tr>
         <w:tc>
           <w:tcPr>
-            <w:tcW w:type="dxa" w:w="858"/>
+            <w:tcW w:type="dxa" w:w="826"/>
           </w:tcPr>
           <w:p>
             <w:pPr>
@@ -5109,7 +5109,7 @@
         </w:tc>
         <w:tc>
           <w:tcPr>
-            <w:tcW w:type="dxa" w:w="2525"/>
+            <w:tcW w:type="dxa" w:w="3039"/>
           </w:tcPr>
           <w:p>
             <w:pPr>
@@ -5126,7 +5126,7 @@
         </w:tc>
         <w:tc>
           <w:tcPr>
-            <w:tcW w:type="dxa" w:w="3461"/>
+            <w:tcW w:type="dxa" w:w="3091"/>
           </w:tcPr>
           <w:p>
             <w:pPr>
@@ -5142,7 +5142,7 @@
         </w:tc>
         <w:tc>
           <w:tcPr>
-            <w:tcW w:type="dxa" w:w="936"/>
+            <w:tcW w:type="dxa" w:w="879"/>
           </w:tcPr>
           <w:p>
             <w:pPr>
@@ -5160,7 +5160,7 @@
         </w:tc>
         <w:tc>
           <w:tcPr>
-            <w:tcW w:type="dxa" w:w="1291"/>
+            <w:tcW w:type="dxa" w:w="1235"/>
           </w:tcPr>
           <w:p>
             <w:pPr>
@@ -5178,7 +5178,7 @@
       <w:tr>
         <w:tc>
           <w:tcPr>
-            <w:tcW w:type="dxa" w:w="858"/>
+            <w:tcW w:type="dxa" w:w="826"/>
           </w:tcPr>
           <w:p>
             <w:pPr>
@@ -5194,7 +5194,7 @@
         </w:tc>
         <w:tc>
           <w:tcPr>
-            <w:tcW w:type="dxa" w:w="2525"/>
+            <w:tcW w:type="dxa" w:w="3039"/>
           </w:tcPr>
           <w:p>
             <w:pPr>
@@ -5217,7 +5217,7 @@
         </w:tc>
         <w:tc>
           <w:tcPr>
-            <w:tcW w:type="dxa" w:w="3461"/>
+            <w:tcW w:type="dxa" w:w="3091"/>
           </w:tcPr>
           <w:p>
             <w:pPr>
@@ -5233,7 +5233,7 @@
         </w:tc>
         <w:tc>
           <w:tcPr>
-            <w:tcW w:type="dxa" w:w="936"/>
+            <w:tcW w:type="dxa" w:w="879"/>
           </w:tcPr>
           <w:p>
             <w:pPr>
@@ -5251,7 +5251,7 @@
         </w:tc>
         <w:tc>
           <w:tcPr>
-            <w:tcW w:type="dxa" w:w="1291"/>
+            <w:tcW w:type="dxa" w:w="1235"/>
           </w:tcPr>
           <w:p>
             <w:pPr>
@@ -5269,7 +5269,7 @@
       <w:tr>
         <w:tc>
           <w:tcPr>
-            <w:tcW w:type="dxa" w:w="858"/>
+            <w:tcW w:type="dxa" w:w="826"/>
           </w:tcPr>
           <w:p>
             <w:pPr>
@@ -5285,7 +5285,7 @@
         </w:tc>
         <w:tc>
           <w:tcPr>
-            <w:tcW w:type="dxa" w:w="2525"/>
+            <w:tcW w:type="dxa" w:w="3039"/>
           </w:tcPr>
           <w:p>
             <w:pPr>
@@ -5360,7 +5360,7 @@
         </w:tc>
         <w:tc>
           <w:tcPr>
-            <w:tcW w:type="dxa" w:w="3461"/>
+            <w:tcW w:type="dxa" w:w="3091"/>
           </w:tcPr>
           <w:p>
             <w:pPr>
@@ -5376,7 +5376,7 @@
         </w:tc>
         <w:tc>
           <w:tcPr>
-            <w:tcW w:type="dxa" w:w="936"/>
+            <w:tcW w:type="dxa" w:w="879"/>
           </w:tcPr>
           <w:p>
             <w:pPr>
@@ -5394,7 +5394,7 @@
         </w:tc>
         <w:tc>
           <w:tcPr>
-            <w:tcW w:type="dxa" w:w="1291"/>
+            <w:tcW w:type="dxa" w:w="1235"/>
           </w:tcPr>
           <w:p>
             <w:pPr>
@@ -5412,7 +5412,7 @@
       <w:tr>
         <w:tc>
           <w:tcPr>
-            <w:tcW w:type="dxa" w:w="858"/>
+            <w:tcW w:type="dxa" w:w="826"/>
           </w:tcPr>
           <w:p>
             <w:pPr>
@@ -5428,7 +5428,7 @@
         </w:tc>
         <w:tc>
           <w:tcPr>
-            <w:tcW w:type="dxa" w:w="2525"/>
+            <w:tcW w:type="dxa" w:w="3039"/>
           </w:tcPr>
           <w:p>
             <w:pPr>
@@ -5464,7 +5464,7 @@
         </w:tc>
         <w:tc>
           <w:tcPr>
-            <w:tcW w:type="dxa" w:w="3461"/>
+            <w:tcW w:type="dxa" w:w="3091"/>
           </w:tcPr>
           <w:p>
             <w:pPr>
@@ -5480,7 +5480,7 @@
         </w:tc>
         <w:tc>
           <w:tcPr>
-            <w:tcW w:type="dxa" w:w="936"/>
+            <w:tcW w:type="dxa" w:w="879"/>
           </w:tcPr>
           <w:p>
             <w:pPr>
@@ -5498,7 +5498,7 @@
         </w:tc>
         <w:tc>
           <w:tcPr>
-            <w:tcW w:type="dxa" w:w="1291"/>
+            <w:tcW w:type="dxa" w:w="1235"/>
           </w:tcPr>
           <w:p>
             <w:pPr>
@@ -5516,7 +5516,7 @@
       <w:tr>
         <w:tc>
           <w:tcPr>
-            <w:tcW w:type="dxa" w:w="858"/>
+            <w:tcW w:type="dxa" w:w="826"/>
           </w:tcPr>
           <w:p>
             <w:pPr>
@@ -5532,7 +5532,7 @@
         </w:tc>
         <w:tc>
           <w:tcPr>
-            <w:tcW w:type="dxa" w:w="2525"/>
+            <w:tcW w:type="dxa" w:w="3039"/>
           </w:tcPr>
           <w:p>
             <w:pPr>
@@ -5555,7 +5555,7 @@
         </w:tc>
         <w:tc>
           <w:tcPr>
-            <w:tcW w:type="dxa" w:w="3461"/>
+            <w:tcW w:type="dxa" w:w="3091"/>
           </w:tcPr>
           <w:p>
             <w:pPr>
@@ -5571,7 +5571,7 @@
         </w:tc>
         <w:tc>
           <w:tcPr>
-            <w:tcW w:type="dxa" w:w="936"/>
+            <w:tcW w:type="dxa" w:w="879"/>
           </w:tcPr>
           <w:p>
             <w:pPr>
@@ -5589,7 +5589,7 @@
         </w:tc>
         <w:tc>
           <w:tcPr>
-            <w:tcW w:type="dxa" w:w="1291"/>
+            <w:tcW w:type="dxa" w:w="1235"/>
           </w:tcPr>
           <w:p>
             <w:pPr>
@@ -5607,7 +5607,7 @@
       <w:tr>
         <w:tc>
           <w:tcPr>
-            <w:tcW w:type="dxa" w:w="858"/>
+            <w:tcW w:type="dxa" w:w="826"/>
           </w:tcPr>
           <w:p>
             <w:pPr>
@@ -5623,7 +5623,7 @@
         </w:tc>
         <w:tc>
           <w:tcPr>
-            <w:tcW w:type="dxa" w:w="2525"/>
+            <w:tcW w:type="dxa" w:w="3039"/>
           </w:tcPr>
           <w:p>
             <w:pPr>
@@ -5646,7 +5646,7 @@
         </w:tc>
         <w:tc>
           <w:tcPr>
-            <w:tcW w:type="dxa" w:w="3461"/>
+            <w:tcW w:type="dxa" w:w="3091"/>
           </w:tcPr>
           <w:p>
             <w:pPr>
@@ -5662,7 +5662,7 @@
         </w:tc>
         <w:tc>
           <w:tcPr>
-            <w:tcW w:type="dxa" w:w="936"/>
+            <w:tcW w:type="dxa" w:w="879"/>
           </w:tcPr>
           <w:p>
             <w:pPr>
@@ -5680,7 +5680,7 @@
         </w:tc>
         <w:tc>
           <w:tcPr>
-            <w:tcW w:type="dxa" w:w="1291"/>
+            <w:tcW w:type="dxa" w:w="1235"/>
           </w:tcPr>
           <w:p>
             <w:pPr>
@@ -5698,7 +5698,7 @@
       <w:tr>
         <w:tc>
           <w:tcPr>
-            <w:tcW w:type="dxa" w:w="858"/>
+            <w:tcW w:type="dxa" w:w="826"/>
           </w:tcPr>
           <w:p>
             <w:pPr>
@@ -5714,7 +5714,7 @@
         </w:tc>
         <w:tc>
           <w:tcPr>
-            <w:tcW w:type="dxa" w:w="2525"/>
+            <w:tcW w:type="dxa" w:w="3039"/>
           </w:tcPr>
           <w:p>
             <w:pPr>
@@ -5737,7 +5737,7 @@
         </w:tc>
         <w:tc>
           <w:tcPr>
-            <w:tcW w:type="dxa" w:w="3461"/>
+            <w:tcW w:type="dxa" w:w="3091"/>
           </w:tcPr>
           <w:p>
             <w:pPr>
@@ -5753,7 +5753,7 @@
         </w:tc>
         <w:tc>
           <w:tcPr>
-            <w:tcW w:type="dxa" w:w="936"/>
+            <w:tcW w:type="dxa" w:w="879"/>
           </w:tcPr>
           <w:p>
             <w:pPr>
@@ -5771,7 +5771,7 @@
         </w:tc>
         <w:tc>
           <w:tcPr>
-            <w:tcW w:type="dxa" w:w="1291"/>
+            <w:tcW w:type="dxa" w:w="1235"/>
           </w:tcPr>
           <w:p>
             <w:pPr>
@@ -5789,7 +5789,7 @@
       <w:tr>
         <w:tc>
           <w:tcPr>
-            <w:tcW w:type="dxa" w:w="858"/>
+            <w:tcW w:type="dxa" w:w="826"/>
           </w:tcPr>
           <w:p>
             <w:pPr>
@@ -5805,7 +5805,7 @@
         </w:tc>
         <w:tc>
           <w:tcPr>
-            <w:tcW w:type="dxa" w:w="2525"/>
+            <w:tcW w:type="dxa" w:w="3039"/>
           </w:tcPr>
           <w:p>
             <w:pPr>
@@ -5822,7 +5822,7 @@
         </w:tc>
         <w:tc>
           <w:tcPr>
-            <w:tcW w:type="dxa" w:w="3461"/>
+            <w:tcW w:type="dxa" w:w="3091"/>
           </w:tcPr>
           <w:p>
             <w:pPr>
@@ -5851,7 +5851,7 @@
         </w:tc>
         <w:tc>
           <w:tcPr>
-            <w:tcW w:type="dxa" w:w="936"/>
+            <w:tcW w:type="dxa" w:w="879"/>
           </w:tcPr>
           <w:p>
             <w:pPr>
@@ -5869,7 +5869,7 @@
         </w:tc>
         <w:tc>
           <w:tcPr>
-            <w:tcW w:type="dxa" w:w="1291"/>
+            <w:tcW w:type="dxa" w:w="1235"/>
           </w:tcPr>
           <w:p>
             <w:pPr>
@@ -5887,7 +5887,7 @@
       <w:tr>
         <w:tc>
           <w:tcPr>
-            <w:tcW w:type="dxa" w:w="858"/>
+            <w:tcW w:type="dxa" w:w="826"/>
           </w:tcPr>
           <w:p>
             <w:pPr>
@@ -5903,7 +5903,7 @@
         </w:tc>
         <w:tc>
           <w:tcPr>
-            <w:tcW w:type="dxa" w:w="2525"/>
+            <w:tcW w:type="dxa" w:w="3039"/>
           </w:tcPr>
           <w:p>
             <w:pPr>
@@ -5922,7 +5922,7 @@
                 <w:b/>
                 <w:sz w:val="17"/>
               </w:rPr>
-              <w:t>D:\Platform</w:t>
+              <w:t>D:\ITSupportPlatform</w:t>
             </w:r>
             <w:r>
               <w:rPr>
@@ -5941,7 +5941,7 @@
         </w:tc>
         <w:tc>
           <w:tcPr>
-            <w:tcW w:type="dxa" w:w="3461"/>
+            <w:tcW w:type="dxa" w:w="3091"/>
           </w:tcPr>
           <w:p>
             <w:pPr>
@@ -5957,7 +5957,7 @@
         </w:tc>
         <w:tc>
           <w:tcPr>
-            <w:tcW w:type="dxa" w:w="936"/>
+            <w:tcW w:type="dxa" w:w="879"/>
           </w:tcPr>
           <w:p>
             <w:pPr>
@@ -5975,7 +5975,7 @@
         </w:tc>
         <w:tc>
           <w:tcPr>
-            <w:tcW w:type="dxa" w:w="1291"/>
+            <w:tcW w:type="dxa" w:w="1235"/>
           </w:tcPr>
           <w:p>
             <w:pPr>
@@ -5993,7 +5993,7 @@
       <w:tr>
         <w:tc>
           <w:tcPr>
-            <w:tcW w:type="dxa" w:w="858"/>
+            <w:tcW w:type="dxa" w:w="826"/>
           </w:tcPr>
           <w:p>
             <w:pPr>
@@ -6009,7 +6009,7 @@
         </w:tc>
         <w:tc>
           <w:tcPr>
-            <w:tcW w:type="dxa" w:w="2525"/>
+            <w:tcW w:type="dxa" w:w="3039"/>
           </w:tcPr>
           <w:p>
             <w:pPr>
@@ -6032,7 +6032,7 @@
         </w:tc>
         <w:tc>
           <w:tcPr>
-            <w:tcW w:type="dxa" w:w="3461"/>
+            <w:tcW w:type="dxa" w:w="3091"/>
           </w:tcPr>
           <w:p>
             <w:pPr>
@@ -6048,7 +6048,7 @@
         </w:tc>
         <w:tc>
           <w:tcPr>
-            <w:tcW w:type="dxa" w:w="936"/>
+            <w:tcW w:type="dxa" w:w="879"/>
           </w:tcPr>
           <w:p>
             <w:pPr>
@@ -6066,7 +6066,7 @@
         </w:tc>
         <w:tc>
           <w:tcPr>
-            <w:tcW w:type="dxa" w:w="1291"/>
+            <w:tcW w:type="dxa" w:w="1235"/>
           </w:tcPr>
           <w:p>
             <w:pPr>
@@ -6084,7 +6084,7 @@
       <w:tr>
         <w:tc>
           <w:tcPr>
-            <w:tcW w:type="dxa" w:w="858"/>
+            <w:tcW w:type="dxa" w:w="826"/>
           </w:tcPr>
           <w:p>
             <w:pPr>
@@ -6100,7 +6100,7 @@
         </w:tc>
         <w:tc>
           <w:tcPr>
-            <w:tcW w:type="dxa" w:w="2525"/>
+            <w:tcW w:type="dxa" w:w="3039"/>
           </w:tcPr>
           <w:p>
             <w:pPr>
@@ -6117,7 +6117,7 @@
         </w:tc>
         <w:tc>
           <w:tcPr>
-            <w:tcW w:type="dxa" w:w="3461"/>
+            <w:tcW w:type="dxa" w:w="3091"/>
           </w:tcPr>
           <w:p>
             <w:pPr>
@@ -6133,7 +6133,7 @@
         </w:tc>
         <w:tc>
           <w:tcPr>
-            <w:tcW w:type="dxa" w:w="936"/>
+            <w:tcW w:type="dxa" w:w="879"/>
           </w:tcPr>
           <w:p>
             <w:pPr>
@@ -6151,7 +6151,7 @@
         </w:tc>
         <w:tc>
           <w:tcPr>
-            <w:tcW w:type="dxa" w:w="1291"/>
+            <w:tcW w:type="dxa" w:w="1235"/>
           </w:tcPr>
           <w:p>
             <w:pPr>
@@ -9457,7 +9457,7 @@
         <w:rPr>
           <w:color w:val="5B6966"/>
         </w:rPr>
-        <w:t># Caddyfile, trong khối site :5443 — đặt TRƯỚC "handle @hub"</w:t>
+        <w:t># Caddyfile, trong khối site :5443 — đặt TRƯỚC "handle @hub" (Core cùng máy: 127.0.0.1:7009)</w:t>
       </w:r>
     </w:p>
     <w:p>
@@ -9477,13 +9477,13 @@
         <w:shd w:val="clear" w:color="auto" w:fill="EEF3F1"/>
       </w:pPr>
       <w:r>
-        <w:t xml:space="preserve">    client_ip 10.x.y.15/32                 </w:t>
+        <w:t xml:space="preserve">    client_ip 10.21.30.250/32              </w:t>
       </w:r>
       <w:r>
         <w:rPr>
           <w:color w:val="5B6966"/>
         </w:rPr>
-        <w:t># bước 1: một máy thử</w:t>
+        <w:t># bước 1: một máy thử; bước 2: thêm dải IP của một phòng</w:t>
       </w:r>
     </w:p>
     <w:p>
@@ -9493,13 +9493,7 @@
         <w:shd w:val="clear" w:color="auto" w:fill="EEF3F1"/>
       </w:pPr>
       <w:r>
-        <w:t xml:space="preserve">    </w:t>
-      </w:r>
-      <w:r>
-        <w:rPr>
-          <w:color w:val="5B6966"/>
-        </w:rPr>
-        <w:t># client_ip 10.x.y.0/24               # bước 2: thêm dải IP của một phòng</w:t>
+        <w:t xml:space="preserve">    path /update /check_update /download_setup /client_log /offline /check_command/* /login_result/*</w:t>
       </w:r>
     </w:p>
     <w:p>
@@ -9509,13 +9503,7 @@
         <w:shd w:val="clear" w:color="auto" w:fill="EEF3F1"/>
       </w:pPr>
       <w:r>
-        <w:t xml:space="preserve">    not header User-Agent *Mozilla*        </w:t>
-      </w:r>
-      <w:r>
-        <w:rPr>
-          <w:color w:val="5B6966"/>
-        </w:rPr>
-        <w:t># CHỈ agent; trình duyệt của GV ngồi máy đó vẫn về web cũ</w:t>
+        <w:t xml:space="preserve">    path /ps_auth_result/* /pty_auth_result/* /ps_bulk_result/* /send_report /collect_upload /collect_report</w:t>
       </w:r>
     </w:p>
     <w:p>
@@ -9525,7 +9513,7 @@
         <w:shd w:val="clear" w:color="auto" w:fill="EEF3F1"/>
       </w:pPr>
       <w:r>
-        <w:t>}</w:t>
+        <w:t xml:space="preserve">    path /work_file/* /fs_recv /fs_recv_raw /fs_serve/* /fs_bridge/* /socket.io/*</w:t>
       </w:r>
     </w:p>
     <w:p>
@@ -9535,7 +9523,7 @@
         <w:shd w:val="clear" w:color="auto" w:fill="EEF3F1"/>
       </w:pPr>
       <w:r>
-        <w:t>handle @core_canary {</w:t>
+        <w:t>}</w:t>
       </w:r>
     </w:p>
     <w:p>
@@ -9545,7 +9533,17 @@
         <w:shd w:val="clear" w:color="auto" w:fill="EEF3F1"/>
       </w:pPr>
       <w:r>
-        <w:t xml:space="preserve">    reverse_proxy &lt;IP-VM-Core&gt;:7009</w:t>
+        <w:t>handle @core_canary {</w:t>
+      </w:r>
+    </w:p>
+    <w:p>
+      <w:pPr>
+        <w:pStyle w:val="CodeBlock"/>
+        <w:ind w:left="113"/>
+        <w:shd w:val="clear" w:color="auto" w:fill="EEF3F1"/>
+      </w:pPr>
+      <w:r>
+        <w:t xml:space="preserve">    reverse_proxy 127.0.0.1:7009</w:t>
       </w:r>
     </w:p>
     <w:p>
@@ -9614,34 +9612,73 @@
           </w:p>
           <w:p>
             <w:r>
-              <w:t xml:space="preserve">(1) Giữ nguyên chứng thư TLS của cổng 5443, vì agent cũ ghim chứng thư (quyết định đã ghi: không xoay khoá máy chủ). (2) Kiểm User-Agent thật của agent trong log Caddy trước khi dùng điều kiện </w:t>
+              <w:t xml:space="preserve">(1) Giữ nguyên chứng thư TLS của cổng 5443, vì agent cũ ghim chứng thư (quyết định đã ghi: không xoay khoá máy chủ). (2) Lọc theo </w:t>
+            </w:r>
+            <w:r>
+              <w:rPr>
+                <w:b/>
+              </w:rPr>
+              <w:t>IP + danh sách đường dẫn của agent</w:t>
+            </w:r>
+            <w:r>
+              <w:t xml:space="preserve">, KHÔNG theo User-Agent: agent 2.7.5.3 tự gửi </w:t>
             </w:r>
             <w:r>
               <w:rPr>
                 <w:rFonts w:ascii="Consolas" w:hAnsi="Consolas" w:eastAsia="Consolas" w:cs="Consolas"/>
                 <w:sz w:val="21"/>
               </w:rPr>
-              <w:t>not header User-Agent *Mozilla*</w:t>
-            </w:r>
-            <w:r>
-              <w:t xml:space="preserve">. (3) Kiểm thứ tự khối bằng </w:t>
+              <w:t>User-Agent: Mozilla/5.0</w:t>
+            </w:r>
+            <w:r>
+              <w:t xml:space="preserve"> ở </w:t>
             </w:r>
             <w:r>
               <w:rPr>
                 <w:rFonts w:ascii="Consolas" w:hAnsi="Consolas" w:eastAsia="Consolas" w:cs="Consolas"/>
                 <w:sz w:val="21"/>
               </w:rPr>
+              <w:t>/check_update</w:t>
+            </w:r>
+            <w:r>
+              <w:t xml:space="preserve"> và </w:t>
+            </w:r>
+            <w:r>
+              <w:rPr>
+                <w:rFonts w:ascii="Consolas" w:hAnsi="Consolas" w:eastAsia="Consolas" w:cs="Consolas"/>
+                <w:sz w:val="21"/>
+              </w:rPr>
+              <w:t>/download_setup</w:t>
+            </w:r>
+            <w:r>
+              <w:t xml:space="preserve"> (đo từ mã nguồn 02/10/2026, HOP_DONG mục A11). Trình duyệt của GV ngồi máy đó vẫn về web cũ vì trang web không nằm trong danh sách đường dẫn. (3) Kiểm thứ tự khối bằng </w:t>
+            </w:r>
+            <w:r>
+              <w:rPr>
+                <w:rFonts w:ascii="Consolas" w:hAnsi="Consolas" w:eastAsia="Consolas" w:cs="Consolas"/>
+                <w:sz w:val="21"/>
+              </w:rPr>
               <w:t>caddy adapt --pretty</w:t>
             </w:r>
             <w:r>
-              <w:t xml:space="preserve">: khối canary phải đứng trước khối </w:t>
+              <w:t xml:space="preserve">: đích </w:t>
             </w:r>
             <w:r>
               <w:rPr>
                 <w:rFonts w:ascii="Consolas" w:hAnsi="Consolas" w:eastAsia="Consolas" w:cs="Consolas"/>
                 <w:sz w:val="21"/>
               </w:rPr>
-              <w:t>@hub</w:t>
+              <w:t>127.0.0.1:7009</w:t>
+            </w:r>
+            <w:r>
+              <w:t xml:space="preserve"> phải đứng trước </w:t>
+            </w:r>
+            <w:r>
+              <w:rPr>
+                <w:rFonts w:ascii="Consolas" w:hAnsi="Consolas" w:eastAsia="Consolas" w:cs="Consolas"/>
+                <w:sz w:val="21"/>
+              </w:rPr>
+              <w:t>127.0.0.1:5009</w:t>
             </w:r>
             <w:r>
               <w:t>.</w:t>
@@ -11274,7 +11311,7 @@
           <w:rFonts w:ascii="Consolas" w:hAnsi="Consolas" w:eastAsia="Consolas" w:cs="Consolas"/>
           <w:sz w:val="21"/>
         </w:rPr>
-        <w:t>D:\Platform</w:t>
+        <w:t>D:\ITSupportPlatform</w:t>
       </w:r>
       <w:r>
         <w:t xml:space="preserve">. Claude đọc mã nguồn và tài liệu hiện có để hiểu hành vi cần giữ, nhưng </w:t>
@@ -11819,7 +11856,7 @@
           <w:rFonts w:ascii="Consolas" w:hAnsi="Consolas" w:eastAsia="Consolas" w:cs="Consolas"/>
           <w:sz w:val="21"/>
         </w:rPr>
-        <w:t>D:\Platform</w:t>
+        <w:t>D:\ITSupportPlatform</w:t>
       </w:r>
       <w:r>
         <w:t xml:space="preserve">; thư mục cũ thêm bằng </w:t>
@@ -20476,7 +20513,7 @@
           <w:rFonts w:ascii="Consolas" w:hAnsi="Consolas" w:eastAsia="Consolas" w:cs="Consolas"/>
           <w:sz w:val="21"/>
         </w:rPr>
-        <w:t>D:\Platform</w:t>
+        <w:t>D:\ITSupportPlatform</w:t>
       </w:r>
       <w:r>
         <w:t xml:space="preserve"> (repo mới ở GĐ2 sẽ clone vào đây).</w:t>
@@ -20501,7 +20538,7 @@
           <w:rFonts w:ascii="Consolas" w:hAnsi="Consolas" w:eastAsia="Consolas" w:cs="Consolas"/>
           <w:sz w:val="21"/>
         </w:rPr>
-        <w:t>D:\Platform</w:t>
+        <w:t>D:\ITSupportPlatform</w:t>
       </w:r>
       <w:r>
         <w:t xml:space="preserve">; thêm thư mục cũ để </w:t>
@@ -20599,7 +20636,7 @@
           <w:rFonts w:ascii="Consolas" w:hAnsi="Consolas" w:eastAsia="Consolas" w:cs="Consolas"/>
           <w:sz w:val="21"/>
         </w:rPr>
-        <w:t>D:\Platform\CLAUDE.md</w:t>
+        <w:t>D:\ITSupportPlatform\CLAUDE.md</w:t>
       </w:r>
       <w:r>
         <w:t xml:space="preserve"> = khối CLAUDE.md ở </w:t>
@@ -22681,7 +22718,7 @@
           <w:rFonts w:ascii="Consolas" w:hAnsi="Consolas" w:eastAsia="Consolas" w:cs="Consolas"/>
           <w:sz w:val="21"/>
         </w:rPr>
-        <w:t>D:\Platform</w:t>
+        <w:t>D:\ITSupportPlatform</w:t>
       </w:r>
       <w:r>
         <w:t xml:space="preserve"> → </w:t>
@@ -22755,7 +22792,7 @@
         <w:shd w:val="clear" w:color="auto" w:fill="EEF3F1"/>
       </w:pPr>
       <w:r>
-        <w:t>cd D:\Platform</w:t>
+        <w:t>cd D:\ITSupportPlatform</w:t>
       </w:r>
     </w:p>
     <w:p>
@@ -22882,7 +22919,7 @@
           <w:rFonts w:ascii="Consolas" w:hAnsi="Consolas" w:eastAsia="Consolas" w:cs="Consolas"/>
           <w:sz w:val="21"/>
         </w:rPr>
-        <w:t>D:\PlatformSecrets\core.env</w:t>
+        <w:t>D:\ITSupportPlatformSecrets\core.env</w:t>
       </w:r>
       <w:r>
         <w:t xml:space="preserve"> (chuỗi kết nối MongoDB, khoá chính AES, khoá ký Ed25519). Thêm vào </w:t>
@@ -23459,7 +23496,7 @@
           <w:rFonts w:ascii="Consolas" w:hAnsi="Consolas" w:eastAsia="Consolas" w:cs="Consolas"/>
           <w:sz w:val="21"/>
         </w:rPr>
-        <w:t>D:\Platform\platform-core\.venv\Scripts\python.exe</w:t>
+        <w:t>D:\ITSupportPlatform\platform-core\.venv\Scripts\python.exe</w:t>
       </w:r>
       <w:r>
         <w:t xml:space="preserve">, Startup directory </w:t>
@@ -23469,7 +23506,7 @@
           <w:rFonts w:ascii="Consolas" w:hAnsi="Consolas" w:eastAsia="Consolas" w:cs="Consolas"/>
           <w:sz w:val="21"/>
         </w:rPr>
-        <w:t>D:\Platform\platform-core</w:t>
+        <w:t>D:\ITSupportPlatform\platform-core</w:t>
       </w:r>
       <w:r>
         <w:t xml:space="preserve">, Arguments </w:t>
@@ -23574,7 +23611,7 @@
           <w:rFonts w:ascii="Consolas" w:hAnsi="Consolas" w:eastAsia="Consolas" w:cs="Consolas"/>
           <w:sz w:val="21"/>
         </w:rPr>
-        <w:t>D:\Platform\logs\core-out.log</w:t>
+        <w:t>D:\ITSupportPlatform\logs\core-out.log</w:t>
       </w:r>
       <w:r>
         <w:t xml:space="preserve">, Error </w:t>
@@ -23584,7 +23621,7 @@
           <w:rFonts w:ascii="Consolas" w:hAnsi="Consolas" w:eastAsia="Consolas" w:cs="Consolas"/>
           <w:sz w:val="21"/>
         </w:rPr>
-        <w:t>D:\Platform\logs\core-err.log</w:t>
+        <w:t>D:\ITSupportPlatform\logs\core-err.log</w:t>
       </w:r>
       <w:r>
         <w:t>.</w:t>
@@ -25431,7 +25468,7 @@
         <w:shd w:val="clear" w:color="auto" w:fill="EEF3F1"/>
       </w:pPr>
       <w:r>
-        <w:t>cd D:\Platform</w:t>
+        <w:t>cd D:\ITSupportPlatform</w:t>
       </w:r>
     </w:p>
     <w:p>
@@ -27078,7 +27115,7 @@
           <w:rFonts w:ascii="Consolas" w:hAnsi="Consolas" w:eastAsia="Consolas" w:cs="Consolas"/>
           <w:sz w:val="21"/>
         </w:rPr>
-        <w:t>D:\PlatformData\tenants\&lt;tenant_id&gt;\{work,collected,thu,chat,report,temp}</w:t>
+        <w:t>D:\ITSupportPlatformData\tenants\&lt;tenant_id&gt;\{work,collected,thu,chat,report,temp}</w:t>
       </w:r>
       <w:r>
         <w:t xml:space="preserve">; truyền dạng luồng; metadata vào </w:t>
@@ -27998,7 +28035,7 @@
           <w:rFonts w:ascii="Consolas" w:hAnsi="Consolas" w:eastAsia="Consolas" w:cs="Consolas"/>
           <w:sz w:val="21"/>
         </w:rPr>
-        <w:t>D:\Platform\CLAUDE.md</w:t>
+        <w:t>D:\ITSupportPlatform\CLAUDE.md</w:t>
       </w:r>
       <w:r>
         <w:t xml:space="preserve"> (</w:t>
@@ -28959,11 +28996,11 @@
         </w:tblBorders>
       </w:tblPr>
       <w:tblGrid>
-        <w:gridCol w:w="886"/>
-        <w:gridCol w:w="3342"/>
-        <w:gridCol w:w="965"/>
-        <w:gridCol w:w="956"/>
-        <w:gridCol w:w="2922"/>
+        <w:gridCol w:w="842"/>
+        <w:gridCol w:w="3047"/>
+        <w:gridCol w:w="897"/>
+        <w:gridCol w:w="892"/>
+        <w:gridCol w:w="3392"/>
       </w:tblGrid>
       <w:tr>
         <w:trPr>
@@ -28971,7 +29008,7 @@
         </w:trPr>
         <w:tc>
           <w:tcPr>
-            <w:tcW w:type="dxa" w:w="886"/>
+            <w:tcW w:type="dxa" w:w="842"/>
             <w:shd w:val="clear" w:color="auto" w:fill="E3ECE9"/>
           </w:tcPr>
           <w:p>
@@ -28989,7 +29026,7 @@
         </w:tc>
         <w:tc>
           <w:tcPr>
-            <w:tcW w:type="dxa" w:w="3342"/>
+            <w:tcW w:type="dxa" w:w="3047"/>
             <w:shd w:val="clear" w:color="auto" w:fill="E3ECE9"/>
           </w:tcPr>
           <w:p>
@@ -29007,7 +29044,7 @@
         </w:tc>
         <w:tc>
           <w:tcPr>
-            <w:tcW w:type="dxa" w:w="965"/>
+            <w:tcW w:type="dxa" w:w="897"/>
             <w:shd w:val="clear" w:color="auto" w:fill="E3ECE9"/>
           </w:tcPr>
           <w:p>
@@ -29025,7 +29062,7 @@
         </w:tc>
         <w:tc>
           <w:tcPr>
-            <w:tcW w:type="dxa" w:w="956"/>
+            <w:tcW w:type="dxa" w:w="892"/>
             <w:shd w:val="clear" w:color="auto" w:fill="E3ECE9"/>
           </w:tcPr>
           <w:p>
@@ -29043,7 +29080,7 @@
         </w:tc>
         <w:tc>
           <w:tcPr>
-            <w:tcW w:type="dxa" w:w="2922"/>
+            <w:tcW w:type="dxa" w:w="3392"/>
             <w:shd w:val="clear" w:color="auto" w:fill="E3ECE9"/>
           </w:tcPr>
           <w:p>
@@ -29063,7 +29100,7 @@
       <w:tr>
         <w:tc>
           <w:tcPr>
-            <w:tcW w:type="dxa" w:w="886"/>
+            <w:tcW w:type="dxa" w:w="842"/>
           </w:tcPr>
           <w:p>
             <w:pPr>
@@ -29079,7 +29116,7 @@
         </w:tc>
         <w:tc>
           <w:tcPr>
-            <w:tcW w:type="dxa" w:w="3342"/>
+            <w:tcW w:type="dxa" w:w="3047"/>
           </w:tcPr>
           <w:p>
             <w:pPr>
@@ -29095,7 +29132,7 @@
         </w:tc>
         <w:tc>
           <w:tcPr>
-            <w:tcW w:type="dxa" w:w="965"/>
+            <w:tcW w:type="dxa" w:w="897"/>
           </w:tcPr>
           <w:p>
             <w:pPr>
@@ -29113,7 +29150,7 @@
         </w:tc>
         <w:tc>
           <w:tcPr>
-            <w:tcW w:type="dxa" w:w="956"/>
+            <w:tcW w:type="dxa" w:w="892"/>
           </w:tcPr>
           <w:p>
             <w:pPr>
@@ -29131,7 +29168,7 @@
         </w:tc>
         <w:tc>
           <w:tcPr>
-            <w:tcW w:type="dxa" w:w="2922"/>
+            <w:tcW w:type="dxa" w:w="3392"/>
           </w:tcPr>
           <w:p>
             <w:pPr>
@@ -29149,7 +29186,7 @@
       <w:tr>
         <w:tc>
           <w:tcPr>
-            <w:tcW w:type="dxa" w:w="886"/>
+            <w:tcW w:type="dxa" w:w="842"/>
           </w:tcPr>
           <w:p>
             <w:pPr>
@@ -29165,7 +29202,7 @@
         </w:tc>
         <w:tc>
           <w:tcPr>
-            <w:tcW w:type="dxa" w:w="3342"/>
+            <w:tcW w:type="dxa" w:w="3047"/>
           </w:tcPr>
           <w:p>
             <w:pPr>
@@ -29181,7 +29218,7 @@
         </w:tc>
         <w:tc>
           <w:tcPr>
-            <w:tcW w:type="dxa" w:w="965"/>
+            <w:tcW w:type="dxa" w:w="897"/>
           </w:tcPr>
           <w:p>
             <w:pPr>
@@ -29199,7 +29236,7 @@
         </w:tc>
         <w:tc>
           <w:tcPr>
-            <w:tcW w:type="dxa" w:w="956"/>
+            <w:tcW w:type="dxa" w:w="892"/>
           </w:tcPr>
           <w:p>
             <w:pPr>
@@ -29217,7 +29254,7 @@
         </w:tc>
         <w:tc>
           <w:tcPr>
-            <w:tcW w:type="dxa" w:w="2922"/>
+            <w:tcW w:type="dxa" w:w="3392"/>
           </w:tcPr>
           <w:p>
             <w:pPr>
@@ -29235,7 +29272,7 @@
       <w:tr>
         <w:tc>
           <w:tcPr>
-            <w:tcW w:type="dxa" w:w="886"/>
+            <w:tcW w:type="dxa" w:w="842"/>
           </w:tcPr>
           <w:p>
             <w:pPr>
@@ -29251,7 +29288,7 @@
         </w:tc>
         <w:tc>
           <w:tcPr>
-            <w:tcW w:type="dxa" w:w="3342"/>
+            <w:tcW w:type="dxa" w:w="3047"/>
           </w:tcPr>
           <w:p>
             <w:pPr>
@@ -29267,7 +29304,7 @@
         </w:tc>
         <w:tc>
           <w:tcPr>
-            <w:tcW w:type="dxa" w:w="965"/>
+            <w:tcW w:type="dxa" w:w="897"/>
           </w:tcPr>
           <w:p>
             <w:pPr>
@@ -29285,7 +29322,7 @@
         </w:tc>
         <w:tc>
           <w:tcPr>
-            <w:tcW w:type="dxa" w:w="956"/>
+            <w:tcW w:type="dxa" w:w="892"/>
           </w:tcPr>
           <w:p>
             <w:pPr>
@@ -29303,7 +29340,7 @@
         </w:tc>
         <w:tc>
           <w:tcPr>
-            <w:tcW w:type="dxa" w:w="2922"/>
+            <w:tcW w:type="dxa" w:w="3392"/>
           </w:tcPr>
           <w:p>
             <w:pPr>
@@ -29321,7 +29358,7 @@
       <w:tr>
         <w:tc>
           <w:tcPr>
-            <w:tcW w:type="dxa" w:w="886"/>
+            <w:tcW w:type="dxa" w:w="842"/>
           </w:tcPr>
           <w:p>
             <w:pPr>
@@ -29337,7 +29374,7 @@
         </w:tc>
         <w:tc>
           <w:tcPr>
-            <w:tcW w:type="dxa" w:w="3342"/>
+            <w:tcW w:type="dxa" w:w="3047"/>
           </w:tcPr>
           <w:p>
             <w:pPr>
@@ -29353,7 +29390,7 @@
         </w:tc>
         <w:tc>
           <w:tcPr>
-            <w:tcW w:type="dxa" w:w="965"/>
+            <w:tcW w:type="dxa" w:w="897"/>
           </w:tcPr>
           <w:p>
             <w:pPr>
@@ -29371,7 +29408,7 @@
         </w:tc>
         <w:tc>
           <w:tcPr>
-            <w:tcW w:type="dxa" w:w="956"/>
+            <w:tcW w:type="dxa" w:w="892"/>
           </w:tcPr>
           <w:p>
             <w:pPr>
@@ -29389,7 +29426,7 @@
         </w:tc>
         <w:tc>
           <w:tcPr>
-            <w:tcW w:type="dxa" w:w="2922"/>
+            <w:tcW w:type="dxa" w:w="3392"/>
           </w:tcPr>
           <w:p>
             <w:pPr>
@@ -29420,7 +29457,7 @@
       <w:tr>
         <w:tc>
           <w:tcPr>
-            <w:tcW w:type="dxa" w:w="886"/>
+            <w:tcW w:type="dxa" w:w="842"/>
           </w:tcPr>
           <w:p>
             <w:pPr>
@@ -29436,7 +29473,7 @@
         </w:tc>
         <w:tc>
           <w:tcPr>
-            <w:tcW w:type="dxa" w:w="3342"/>
+            <w:tcW w:type="dxa" w:w="3047"/>
           </w:tcPr>
           <w:p>
             <w:pPr>
@@ -29452,7 +29489,7 @@
         </w:tc>
         <w:tc>
           <w:tcPr>
-            <w:tcW w:type="dxa" w:w="965"/>
+            <w:tcW w:type="dxa" w:w="897"/>
           </w:tcPr>
           <w:p>
             <w:pPr>
@@ -29470,7 +29507,7 @@
         </w:tc>
         <w:tc>
           <w:tcPr>
-            <w:tcW w:type="dxa" w:w="956"/>
+            <w:tcW w:type="dxa" w:w="892"/>
           </w:tcPr>
           <w:p>
             <w:pPr>
@@ -29488,7 +29525,7 @@
         </w:tc>
         <w:tc>
           <w:tcPr>
-            <w:tcW w:type="dxa" w:w="2922"/>
+            <w:tcW w:type="dxa" w:w="3392"/>
           </w:tcPr>
           <w:p>
             <w:pPr>
@@ -29506,7 +29543,7 @@
       <w:tr>
         <w:tc>
           <w:tcPr>
-            <w:tcW w:type="dxa" w:w="886"/>
+            <w:tcW w:type="dxa" w:w="842"/>
           </w:tcPr>
           <w:p>
             <w:pPr>
@@ -29522,7 +29559,7 @@
         </w:tc>
         <w:tc>
           <w:tcPr>
-            <w:tcW w:type="dxa" w:w="3342"/>
+            <w:tcW w:type="dxa" w:w="3047"/>
           </w:tcPr>
           <w:p>
             <w:pPr>
@@ -29538,7 +29575,7 @@
         </w:tc>
         <w:tc>
           <w:tcPr>
-            <w:tcW w:type="dxa" w:w="965"/>
+            <w:tcW w:type="dxa" w:w="897"/>
           </w:tcPr>
           <w:p>
             <w:pPr>
@@ -29556,7 +29593,7 @@
         </w:tc>
         <w:tc>
           <w:tcPr>
-            <w:tcW w:type="dxa" w:w="956"/>
+            <w:tcW w:type="dxa" w:w="892"/>
           </w:tcPr>
           <w:p>
             <w:pPr>
@@ -29574,7 +29611,7 @@
         </w:tc>
         <w:tc>
           <w:tcPr>
-            <w:tcW w:type="dxa" w:w="2922"/>
+            <w:tcW w:type="dxa" w:w="3392"/>
           </w:tcPr>
           <w:p>
             <w:pPr>
@@ -29592,7 +29629,7 @@
       <w:tr>
         <w:tc>
           <w:tcPr>
-            <w:tcW w:type="dxa" w:w="886"/>
+            <w:tcW w:type="dxa" w:w="842"/>
           </w:tcPr>
           <w:p>
             <w:pPr>
@@ -29608,7 +29645,7 @@
         </w:tc>
         <w:tc>
           <w:tcPr>
-            <w:tcW w:type="dxa" w:w="3342"/>
+            <w:tcW w:type="dxa" w:w="3047"/>
           </w:tcPr>
           <w:p>
             <w:pPr>
@@ -29624,7 +29661,7 @@
         </w:tc>
         <w:tc>
           <w:tcPr>
-            <w:tcW w:type="dxa" w:w="965"/>
+            <w:tcW w:type="dxa" w:w="897"/>
           </w:tcPr>
           <w:p>
             <w:pPr>
@@ -29642,7 +29679,7 @@
         </w:tc>
         <w:tc>
           <w:tcPr>
-            <w:tcW w:type="dxa" w:w="956"/>
+            <w:tcW w:type="dxa" w:w="892"/>
           </w:tcPr>
           <w:p>
             <w:pPr>
@@ -29660,7 +29697,7 @@
         </w:tc>
         <w:tc>
           <w:tcPr>
-            <w:tcW w:type="dxa" w:w="2922"/>
+            <w:tcW w:type="dxa" w:w="3392"/>
           </w:tcPr>
           <w:p>
             <w:pPr>
@@ -29678,7 +29715,7 @@
       <w:tr>
         <w:tc>
           <w:tcPr>
-            <w:tcW w:type="dxa" w:w="886"/>
+            <w:tcW w:type="dxa" w:w="842"/>
           </w:tcPr>
           <w:p>
             <w:pPr>
@@ -29694,7 +29731,7 @@
         </w:tc>
         <w:tc>
           <w:tcPr>
-            <w:tcW w:type="dxa" w:w="3342"/>
+            <w:tcW w:type="dxa" w:w="3047"/>
           </w:tcPr>
           <w:p>
             <w:pPr>
@@ -29710,7 +29747,7 @@
         </w:tc>
         <w:tc>
           <w:tcPr>
-            <w:tcW w:type="dxa" w:w="965"/>
+            <w:tcW w:type="dxa" w:w="897"/>
           </w:tcPr>
           <w:p>
             <w:pPr>
@@ -29728,7 +29765,7 @@
         </w:tc>
         <w:tc>
           <w:tcPr>
-            <w:tcW w:type="dxa" w:w="956"/>
+            <w:tcW w:type="dxa" w:w="892"/>
           </w:tcPr>
           <w:p>
             <w:pPr>
@@ -29746,7 +29783,7 @@
         </w:tc>
         <w:tc>
           <w:tcPr>
-            <w:tcW w:type="dxa" w:w="2922"/>
+            <w:tcW w:type="dxa" w:w="3392"/>
           </w:tcPr>
           <w:p>
             <w:pPr>
@@ -29764,7 +29801,7 @@
       <w:tr>
         <w:tc>
           <w:tcPr>
-            <w:tcW w:type="dxa" w:w="886"/>
+            <w:tcW w:type="dxa" w:w="842"/>
           </w:tcPr>
           <w:p>
             <w:pPr>
@@ -29780,7 +29817,7 @@
         </w:tc>
         <w:tc>
           <w:tcPr>
-            <w:tcW w:type="dxa" w:w="3342"/>
+            <w:tcW w:type="dxa" w:w="3047"/>
           </w:tcPr>
           <w:p>
             <w:pPr>
@@ -29796,7 +29833,7 @@
         </w:tc>
         <w:tc>
           <w:tcPr>
-            <w:tcW w:type="dxa" w:w="965"/>
+            <w:tcW w:type="dxa" w:w="897"/>
           </w:tcPr>
           <w:p>
             <w:pPr>
@@ -29814,7 +29851,7 @@
         </w:tc>
         <w:tc>
           <w:tcPr>
-            <w:tcW w:type="dxa" w:w="956"/>
+            <w:tcW w:type="dxa" w:w="892"/>
           </w:tcPr>
           <w:p>
             <w:pPr>
@@ -29832,7 +29869,7 @@
         </w:tc>
         <w:tc>
           <w:tcPr>
-            <w:tcW w:type="dxa" w:w="2922"/>
+            <w:tcW w:type="dxa" w:w="3392"/>
           </w:tcPr>
           <w:p>
             <w:pPr>
@@ -29850,7 +29887,7 @@
       <w:tr>
         <w:tc>
           <w:tcPr>
-            <w:tcW w:type="dxa" w:w="886"/>
+            <w:tcW w:type="dxa" w:w="842"/>
           </w:tcPr>
           <w:p>
             <w:pPr>
@@ -29866,7 +29903,7 @@
         </w:tc>
         <w:tc>
           <w:tcPr>
-            <w:tcW w:type="dxa" w:w="3342"/>
+            <w:tcW w:type="dxa" w:w="3047"/>
           </w:tcPr>
           <w:p>
             <w:pPr>
@@ -29882,7 +29919,7 @@
         </w:tc>
         <w:tc>
           <w:tcPr>
-            <w:tcW w:type="dxa" w:w="965"/>
+            <w:tcW w:type="dxa" w:w="897"/>
           </w:tcPr>
           <w:p>
             <w:pPr>
@@ -29900,7 +29937,7 @@
         </w:tc>
         <w:tc>
           <w:tcPr>
-            <w:tcW w:type="dxa" w:w="956"/>
+            <w:tcW w:type="dxa" w:w="892"/>
           </w:tcPr>
           <w:p>
             <w:pPr>
@@ -29918,7 +29955,7 @@
         </w:tc>
         <w:tc>
           <w:tcPr>
-            <w:tcW w:type="dxa" w:w="2922"/>
+            <w:tcW w:type="dxa" w:w="3392"/>
           </w:tcPr>
           <w:p>
             <w:pPr>
@@ -29936,7 +29973,7 @@
       <w:tr>
         <w:tc>
           <w:tcPr>
-            <w:tcW w:type="dxa" w:w="886"/>
+            <w:tcW w:type="dxa" w:w="842"/>
           </w:tcPr>
           <w:p>
             <w:pPr>
@@ -29952,7 +29989,7 @@
         </w:tc>
         <w:tc>
           <w:tcPr>
-            <w:tcW w:type="dxa" w:w="3342"/>
+            <w:tcW w:type="dxa" w:w="3047"/>
           </w:tcPr>
           <w:p>
             <w:pPr>
@@ -29968,7 +30005,7 @@
         </w:tc>
         <w:tc>
           <w:tcPr>
-            <w:tcW w:type="dxa" w:w="965"/>
+            <w:tcW w:type="dxa" w:w="897"/>
           </w:tcPr>
           <w:p>
             <w:pPr>
@@ -29986,7 +30023,7 @@
         </w:tc>
         <w:tc>
           <w:tcPr>
-            <w:tcW w:type="dxa" w:w="956"/>
+            <w:tcW w:type="dxa" w:w="892"/>
           </w:tcPr>
           <w:p>
             <w:pPr>
@@ -30004,7 +30041,7 @@
         </w:tc>
         <w:tc>
           <w:tcPr>
-            <w:tcW w:type="dxa" w:w="2922"/>
+            <w:tcW w:type="dxa" w:w="3392"/>
           </w:tcPr>
           <w:p>
             <w:pPr>
@@ -30022,7 +30059,7 @@
       <w:tr>
         <w:tc>
           <w:tcPr>
-            <w:tcW w:type="dxa" w:w="886"/>
+            <w:tcW w:type="dxa" w:w="842"/>
           </w:tcPr>
           <w:p>
             <w:pPr>
@@ -30038,7 +30075,7 @@
         </w:tc>
         <w:tc>
           <w:tcPr>
-            <w:tcW w:type="dxa" w:w="3342"/>
+            <w:tcW w:type="dxa" w:w="3047"/>
           </w:tcPr>
           <w:p>
             <w:pPr>
@@ -30054,7 +30091,7 @@
         </w:tc>
         <w:tc>
           <w:tcPr>
-            <w:tcW w:type="dxa" w:w="965"/>
+            <w:tcW w:type="dxa" w:w="897"/>
           </w:tcPr>
           <w:p>
             <w:pPr>
@@ -30072,7 +30109,7 @@
         </w:tc>
         <w:tc>
           <w:tcPr>
-            <w:tcW w:type="dxa" w:w="956"/>
+            <w:tcW w:type="dxa" w:w="892"/>
           </w:tcPr>
           <w:p>
             <w:pPr>
@@ -30090,7 +30127,7 @@
         </w:tc>
         <w:tc>
           <w:tcPr>
-            <w:tcW w:type="dxa" w:w="2922"/>
+            <w:tcW w:type="dxa" w:w="3392"/>
           </w:tcPr>
           <w:p>
             <w:pPr>
@@ -30108,7 +30145,7 @@
       <w:tr>
         <w:tc>
           <w:tcPr>
-            <w:tcW w:type="dxa" w:w="886"/>
+            <w:tcW w:type="dxa" w:w="842"/>
           </w:tcPr>
           <w:p>
             <w:pPr>
@@ -30124,7 +30161,7 @@
         </w:tc>
         <w:tc>
           <w:tcPr>
-            <w:tcW w:type="dxa" w:w="3342"/>
+            <w:tcW w:type="dxa" w:w="3047"/>
           </w:tcPr>
           <w:p>
             <w:pPr>
@@ -30140,7 +30177,7 @@
         </w:tc>
         <w:tc>
           <w:tcPr>
-            <w:tcW w:type="dxa" w:w="965"/>
+            <w:tcW w:type="dxa" w:w="897"/>
           </w:tcPr>
           <w:p>
             <w:pPr>
@@ -30158,7 +30195,7 @@
         </w:tc>
         <w:tc>
           <w:tcPr>
-            <w:tcW w:type="dxa" w:w="956"/>
+            <w:tcW w:type="dxa" w:w="892"/>
           </w:tcPr>
           <w:p>
             <w:pPr>
@@ -30176,7 +30213,7 @@
         </w:tc>
         <w:tc>
           <w:tcPr>
-            <w:tcW w:type="dxa" w:w="2922"/>
+            <w:tcW w:type="dxa" w:w="3392"/>
           </w:tcPr>
           <w:p>
             <w:pPr>
@@ -30194,7 +30231,7 @@
       <w:tr>
         <w:tc>
           <w:tcPr>
-            <w:tcW w:type="dxa" w:w="886"/>
+            <w:tcW w:type="dxa" w:w="842"/>
           </w:tcPr>
           <w:p>
             <w:pPr>
@@ -30210,7 +30247,7 @@
         </w:tc>
         <w:tc>
           <w:tcPr>
-            <w:tcW w:type="dxa" w:w="3342"/>
+            <w:tcW w:type="dxa" w:w="3047"/>
           </w:tcPr>
           <w:p>
             <w:pPr>
@@ -30226,7 +30263,7 @@
         </w:tc>
         <w:tc>
           <w:tcPr>
-            <w:tcW w:type="dxa" w:w="965"/>
+            <w:tcW w:type="dxa" w:w="897"/>
           </w:tcPr>
           <w:p>
             <w:pPr>
@@ -30244,7 +30281,7 @@
         </w:tc>
         <w:tc>
           <w:tcPr>
-            <w:tcW w:type="dxa" w:w="956"/>
+            <w:tcW w:type="dxa" w:w="892"/>
           </w:tcPr>
           <w:p>
             <w:pPr>
@@ -30262,7 +30299,7 @@
         </w:tc>
         <w:tc>
           <w:tcPr>
-            <w:tcW w:type="dxa" w:w="2922"/>
+            <w:tcW w:type="dxa" w:w="3392"/>
           </w:tcPr>
           <w:p>
             <w:pPr>
@@ -30279,7 +30316,7 @@
                 <w:rFonts w:ascii="Consolas" w:hAnsi="Consolas" w:eastAsia="Consolas" w:cs="Consolas"/>
                 <w:sz w:val="17"/>
               </w:rPr>
-              <w:t>D:\Platform</w:t>
+              <w:t>D:\ITSupportPlatform</w:t>
             </w:r>
             <w:r>
               <w:rPr>
@@ -30340,7 +30377,7 @@
           <w:color w:val="5B6966"/>
           <w:sz w:val="21"/>
         </w:rPr>
-        <w:t>D:\Platform</w:t>
+        <w:t>D:\ITSupportPlatform</w:t>
       </w:r>
       <w:r>
         <w:rPr>
@@ -31136,7 +31173,7 @@
           <w:rFonts w:ascii="Consolas" w:hAnsi="Consolas" w:eastAsia="Consolas" w:cs="Consolas"/>
           <w:sz w:val="21"/>
         </w:rPr>
-        <w:t>D:\Platform</w:t>
+        <w:t>D:\ITSupportPlatform</w:t>
       </w:r>
       <w:r>
         <w:t xml:space="preserve"> </w:t>
@@ -31603,7 +31640,7 @@
           <w:rFonts w:ascii="Consolas" w:hAnsi="Consolas" w:eastAsia="Consolas" w:cs="Consolas"/>
           <w:sz w:val="21"/>
         </w:rPr>
-        <w:t>D:\Platform</w:t>
+        <w:t>D:\ITSupportPlatform</w:t>
       </w:r>
       <w:r>
         <w:t>; dự án cũ chỉ đọc (G10).</w:t>
@@ -31708,7 +31745,7 @@
           <w:rFonts w:ascii="Consolas" w:hAnsi="Consolas" w:eastAsia="Consolas" w:cs="Consolas"/>
           <w:sz w:val="21"/>
         </w:rPr>
-        <w:t>D:\Platform</w:t>
+        <w:t>D:\ITSupportPlatform</w:t>
       </w:r>
       <w:r>
         <w:t xml:space="preserve"> theo đặc tả V3, mỗi giai đoạn qua Pull Request và cổng kiểm thử; mọi thao tác trên máy chủ do người vận hành thực hiện theo Sổ tay.</w:t>
@@ -32560,7 +32597,7 @@
         <w:shd w:val="clear" w:color="auto" w:fill="EEF3F1"/>
       </w:pPr>
       <w:r>
-        <w:t>&gt; **CLAUDE.md của repo mới `D:\Platform`.** Đặt ở gốc repo từ ngày đầu Giai đoạn 2. Nền tảng được Claude</w:t>
+        <w:t>&gt; **CLAUDE.md của repo mới `D:\ITSupportPlatform`.** Đặt ở gốc repo từ ngày đầu Giai đoạn 2. Nền tảng được Claude</w:t>
       </w:r>
     </w:p>
     <w:p>
@@ -32776,7 +32813,7 @@
         <w:shd w:val="clear" w:color="auto" w:fill="EEF3F1"/>
       </w:pPr>
       <w:r>
-        <w:t xml:space="preserve">    Claude được đọc để hiểu hành vi, **không sửa, không tạo, không xoá** tệp ở đó. Mã mới chỉ nằm trong `D:\Platform`.</w:t>
+        <w:t xml:space="preserve">    Claude được đọc để hiểu hành vi, **không sửa, không tạo, không xoá** tệp ở đó. Mã mới chỉ nằm trong `D:\ITSupportPlatform`.</w:t>
       </w:r>
     </w:p>
     <w:p>
@@ -32911,7 +32948,7 @@
         <w:shd w:val="clear" w:color="auto" w:fill="EEF3F1"/>
       </w:pPr>
       <w:r>
-        <w:t>| Cách xây dựng | Claude xây mới hoàn toàn trong `D:\Platform`; dự án cũ chỉ đọc (mục 13) |</w:t>
+        <w:t>| Cách xây dựng | Claude xây mới hoàn toàn trong `D:\ITSupportPlatform`; dự án cũ chỉ đọc (mục 13) |</w:t>
       </w:r>
     </w:p>
     <w:p>
@@ -32992,7 +33029,7 @@
         <w:shd w:val="clear" w:color="auto" w:fill="EEF3F1"/>
       </w:pPr>
       <w:r>
-        <w:t>## 2. Cấu trúc monorepo `D:\Platform` (5 project theo đặc tả §4.1)</w:t>
+        <w:t>## 2. Cấu trúc monorepo `D:\ITSupportPlatform` (5 project theo đặc tả §4.1)</w:t>
       </w:r>
     </w:p>
     <w:p>
@@ -33982,7 +34019,7 @@
         <w:shd w:val="clear" w:color="auto" w:fill="EEF3F1"/>
       </w:pPr>
       <w:r>
-        <w:t>- `StorageService` (giao diện chung): `LocalFS` (on-prem, `D:\PlatformData`) hoặc `S3` (SeaweedFS / dịch vụ S3 trong nước).</w:t>
+        <w:t>- `StorageService` (giao diện chung): `LocalFS` (on-prem, `D:\ITSupportPlatformData`) hoặc `S3` (SeaweedFS / dịch vụ S3 trong nước).</w:t>
       </w:r>
     </w:p>
     <w:p>
@@ -34639,7 +34676,7 @@
         <w:shd w:val="clear" w:color="auto" w:fill="EEF3F1"/>
       </w:pPr>
       <w:r>
-        <w:t>- Bí mật KHÔNG vào repo: `.env` đặt ở `D:\PlatformSecrets\`; pre-commit `gitleaks` chặn khoá/mật khẩu.</w:t>
+        <w:t>- Bí mật KHÔNG vào repo: `.env` đặt ở `D:\ITSupportPlatformSecrets\`; pre-commit `gitleaks` chặn khoá/mật khẩu.</w:t>
       </w:r>
     </w:p>
     <w:p>
@@ -34783,7 +34820,7 @@
         <w:shd w:val="clear" w:color="auto" w:fill="EEF3F1"/>
       </w:pPr>
       <w:r>
-        <w:t>- Claude Code mở tại `D:\Platform`; thư mục cũ thêm bằng `/add-dir` chỉ để đọc; luật **Deny** Edit/Write cho thư mục cũ (`/permissions`).</w:t>
+        <w:t>- Claude Code mở tại `D:\ITSupportPlatform`; thư mục cũ thêm bằng `/add-dir` chỉ để đọc; luật **Deny** Edit/Write cho thư mục cũ (`/permissions`).</w:t>
       </w:r>
     </w:p>
     <w:p>

</xml_diff>